<commit_message>
Update Stage 1 Topic and Data.docx
</commit_message>
<xml_diff>
--- a/Stage 1 Topic and Data.docx
+++ b/Stage 1 Topic and Data.docx
@@ -22,6 +22,50 @@
           <w14:ligatures w14:val="none"/>
         </w:rPr>
         <w:t>Audrey Guess and Grace Hearne</w:t>
+      </w:r>
+    </w:p>
+    <w:p>
+      <w:pPr>
+        <w:shd w:val="clear" w:color="auto" w:fill="FFFFFF"/>
+        <w:spacing w:before="300" w:after="150" w:line="240" w:lineRule="auto"/>
+        <w:outlineLvl w:val="1"/>
+        <w:rPr>
+          <w:rFonts w:ascii="Times New Roman" w:eastAsia="Times New Roman" w:hAnsi="Times New Roman" w:cs="Times New Roman"/>
+          <w:b/>
+          <w:bCs/>
+          <w:color w:val="000000" w:themeColor="text1"/>
+          <w:kern w:val="0"/>
+          <w14:ligatures w14:val="none"/>
+        </w:rPr>
+      </w:pPr>
+      <w:r>
+        <w:rPr>
+          <w:rFonts w:ascii="Times New Roman" w:eastAsia="Times New Roman" w:hAnsi="Times New Roman" w:cs="Times New Roman"/>
+          <w:color w:val="000000" w:themeColor="text1"/>
+          <w:kern w:val="0"/>
+          <w14:ligatures w14:val="none"/>
+        </w:rPr>
+        <w:t xml:space="preserve">GitHub link: </w:t>
+      </w:r>
+      <w:hyperlink r:id="rId5" w:history="1">
+        <w:r>
+          <w:rPr>
+            <w:rStyle w:val="Hyperlink"/>
+            <w:rFonts w:ascii="Times New Roman" w:eastAsia="Times New Roman" w:hAnsi="Times New Roman" w:cs="Times New Roman"/>
+            <w:kern w:val="0"/>
+            <w14:ligatures w14:val="none"/>
+          </w:rPr>
+          <w:t>https://github.com/audrey-guess/Guess-and-Hearne-Data-Analytics-Project</w:t>
+        </w:r>
+      </w:hyperlink>
+      <w:r>
+        <w:rPr>
+          <w:rFonts w:ascii="Times New Roman" w:eastAsia="Times New Roman" w:hAnsi="Times New Roman" w:cs="Times New Roman"/>
+          <w:color w:val="000000" w:themeColor="text1"/>
+          <w:kern w:val="0"/>
+          <w14:ligatures w14:val="none"/>
+        </w:rPr>
+        <w:t xml:space="preserve"> </w:t>
       </w:r>
     </w:p>
     <w:p>
@@ -361,7 +405,7 @@
         </w:rPr>
         <w:t xml:space="preserve">National Highway Traffic Safety Administration (NHTSA) </w:t>
       </w:r>
-      <w:hyperlink r:id="rId5" w:history="1">
+      <w:hyperlink r:id="rId6" w:history="1">
         <w:r>
           <w:rPr>
             <w:rStyle w:val="Hyperlink"/>
@@ -579,17 +623,9 @@
           <w:color w:val="000000" w:themeColor="text1"/>
           <w:shd w:val="clear" w:color="auto" w:fill="FFFFFF"/>
         </w:rPr>
-        <w:t>National Highway Traffic Safety Administration (NHTSA)</w:t>
-      </w:r>
-      <w:r>
-        <w:rPr>
-          <w:rFonts w:ascii="Times New Roman" w:hAnsi="Times New Roman" w:cs="Times New Roman"/>
-          <w:color w:val="000000" w:themeColor="text1"/>
-          <w:shd w:val="clear" w:color="auto" w:fill="FFFFFF"/>
-        </w:rPr>
-        <w:t xml:space="preserve"> </w:t>
-      </w:r>
-      <w:hyperlink r:id="rId6" w:history="1">
+        <w:t xml:space="preserve">National Highway Traffic Safety Administration (NHTSA) </w:t>
+      </w:r>
+      <w:hyperlink r:id="rId7" w:history="1">
         <w:r>
           <w:rPr>
             <w:rStyle w:val="Hyperlink"/>
@@ -614,9 +650,10 @@
           <w:color w:val="000000" w:themeColor="text1"/>
           <w:shd w:val="clear" w:color="auto" w:fill="FFFFFF"/>
         </w:rPr>
+        <w:lastRenderedPageBreak/>
         <w:tab/>
       </w:r>
-      <w:hyperlink r:id="rId7" w:history="1">
+      <w:hyperlink r:id="rId8" w:history="1">
         <w:r>
           <w:rPr>
             <w:rStyle w:val="Hyperlink"/>
@@ -641,7 +678,6 @@
           <w:color w:val="000000" w:themeColor="text1"/>
           <w:shd w:val="clear" w:color="auto" w:fill="FFFFFF"/>
         </w:rPr>
-        <w:lastRenderedPageBreak/>
         <w:t>1990 to present</w:t>
       </w:r>
       <w:r>
@@ -853,15 +889,7 @@
           <w:color w:val="000000" w:themeColor="text1"/>
           <w:shd w:val="clear" w:color="auto" w:fill="FFFFFF"/>
         </w:rPr>
-        <w:t>FRNT_PASS_STARS</w:t>
-      </w:r>
-      <w:r>
-        <w:rPr>
-          <w:rFonts w:ascii="Times New Roman" w:hAnsi="Times New Roman" w:cs="Times New Roman"/>
-          <w:color w:val="000000" w:themeColor="text1"/>
-          <w:shd w:val="clear" w:color="auto" w:fill="FFFFFF"/>
-        </w:rPr>
-        <w:t xml:space="preserve">: </w:t>
+        <w:t xml:space="preserve">FRNT_PASS_STARS: </w:t>
       </w:r>
       <w:r>
         <w:rPr>
@@ -871,23 +899,13 @@
         </w:rPr>
         <w:t xml:space="preserve">safety rating for passenger in front passenger seat. </w:t>
       </w:r>
-      <w:proofErr w:type="spellStart"/>
-      <w:r>
-        <w:rPr>
-          <w:rFonts w:ascii="Times New Roman" w:hAnsi="Times New Roman" w:cs="Times New Roman"/>
-          <w:color w:val="000000" w:themeColor="text1"/>
-          <w:shd w:val="clear" w:color="auto" w:fill="FFFFFF"/>
-        </w:rPr>
-        <w:t>Test</w:t>
-      </w:r>
-      <w:proofErr w:type="spellEnd"/>
-      <w:r>
-        <w:rPr>
-          <w:rFonts w:ascii="Times New Roman" w:hAnsi="Times New Roman" w:cs="Times New Roman"/>
-          <w:color w:val="000000" w:themeColor="text1"/>
-          <w:shd w:val="clear" w:color="auto" w:fill="FFFFFF"/>
-        </w:rPr>
-        <w:t xml:space="preserve"> data obtained from the crashworthiness and rollover tests are used to generate safety ratings for each vehicle, which are included on a label required to be placed on each new vehicle at the point of sale. A rating of five stars indicates the highest safety rating, whereas a one star indicates the lowest rating.</w:t>
+      <w:r>
+        <w:rPr>
+          <w:rFonts w:ascii="Times New Roman" w:hAnsi="Times New Roman" w:cs="Times New Roman"/>
+          <w:color w:val="000000" w:themeColor="text1"/>
+          <w:shd w:val="clear" w:color="auto" w:fill="FFFFFF"/>
+        </w:rPr>
+        <w:t>Test data obtained from the crashworthiness and rollover tests are used to generate safety ratings for each vehicle, which are included on a label required to be placed on each new vehicle at the point of sale. A rating of five stars indicates the highest safety rating, whereas a one star indicates the lowest rating.</w:t>
       </w:r>
     </w:p>
     <w:p>

</xml_diff>